<commit_message>
Hoàn thiện hồ sơ nộp bài: bỏ mã nội bộ trong slide, sửa tham chiếu ngoài gói, thống nhất số liệu kiểm thử, đặt tác giả
Co-Authored-By: Claude Sonnet 5.5 <noreply@anthropic.com>
</commit_message>
<xml_diff>
--- a/docs/tai_lieu_nop_bai/bang_chung_kiem_thu/2-Bao-cao-ket-qua-nghiem-thu.docx
+++ b/docs/tai_lieu_nop_bai/bang_chung_kiem_thu/2-Bao-cao-ket-qua-nghiem-thu.docx
@@ -30,7 +30,7 @@
           <w:rFonts w:ascii="Consolas" w:hAnsi="Consolas" w:eastAsia="Consolas"/>
           <w:sz w:val="20"/>
         </w:rPr>
-        <w:t>04-kiem-thu-nghiem-thu.md</w:t>
+        <w:t>1-Bo-kiem-thu-nghiem-thu.docx</w:t>
       </w:r>
       <w:r>
         <w:rPr>
@@ -3098,7 +3098,7 @@
         <w:rPr>
           <w:b w:val="0"/>
         </w:rPr>
-        <w:t xml:space="preserve"> (895/895 test đơn vị đạt khi chạy toàn bộ với 2 luồng). Đó là các ca khó dựng bằng dữ liệu thật như nhóm 14 người, hòa điểm ranh giới, chính sách giữ sao lưu.</w:t>
+        <w:t xml:space="preserve"> (898/898 test đơn vị đạt khi chạy toàn bộ với 2 luồng). Đó là các ca khó dựng bằng dữ liệu thật như nhóm 14 người, hòa điểm ranh giới, chính sách giữ sao lưu.</w:t>
       </w:r>
     </w:p>
     <w:p>

</xml_diff>